<commit_message>
Week 4 Portfolio Submission
</commit_message>
<xml_diff>
--- a/Portfolio/COMP6841_Week_4.docx
+++ b/Portfolio/COMP6841_Week_4.docx
@@ -142,7 +142,7 @@
           <w:bCs/>
           <w:color w:val="000000" w:themeColor="text1"/>
         </w:rPr>
-        <w:t>7</w:t>
+        <w:t>8</w:t>
       </w:r>
       <w:r>
         <w:rPr>
@@ -187,7 +187,6 @@
         <w:r>
           <w:rPr>
             <w:rStyle w:val="Hyperlink"/>
-            <w:highlight w:val="yellow"/>
           </w:rPr>
           <w:t>Security Everywhere</w:t>
         </w:r>
@@ -221,7 +220,7 @@
                 <w:noProof/>
               </w:rPr>
               <w:drawing>
-                <wp:anchor distT="0" distB="0" distL="114300" distR="114300" simplePos="0" relativeHeight="251659264" behindDoc="0" locked="0" layoutInCell="1" allowOverlap="1" wp14:anchorId="7DBB7C88" wp14:editId="495BDC90">
+                <wp:anchor distT="0" distB="0" distL="114300" distR="114300" simplePos="0" relativeHeight="251659264" behindDoc="0" locked="0" layoutInCell="1" allowOverlap="1" wp14:anchorId="7DBB7C88" wp14:editId="301157D2">
                   <wp:simplePos x="0" y="0"/>
                   <wp:positionH relativeFrom="column">
                     <wp:posOffset>-1905</wp:posOffset>
@@ -368,7 +367,6 @@
         <w:r>
           <w:rPr>
             <w:rStyle w:val="Hyperlink"/>
-            <w:highlight w:val="green"/>
           </w:rPr>
           <w:t>Whistleblower | Spy</w:t>
         </w:r>
@@ -1361,14 +1359,12 @@
         <w:r>
           <w:rPr>
             <w:rStyle w:val="Hyperlink"/>
-            <w:highlight w:val="green"/>
           </w:rPr>
           <w:t>Merkle Puzzle</w:t>
         </w:r>
         <w:r>
           <w:rPr>
             <w:rStyle w:val="Hyperlink"/>
-            <w:highlight w:val="green"/>
           </w:rPr>
           <w:t>s</w:t>
         </w:r>
@@ -1684,7 +1680,6 @@
         <w:r>
           <w:rPr>
             <w:rStyle w:val="Hyperlink"/>
-            <w:highlight w:val="green"/>
           </w:rPr>
           <w:t>Learn how RSA works</w:t>
         </w:r>
@@ -2630,18 +2625,81 @@
               <w:t xml:space="preserve">The void function pointer was assigned above </w:t>
             </w:r>
             <w:r>
-              <w:t>input array meaning that it is nex</w:t>
-            </w:r>
-            <w:r>
-              <w:t>t geg</w:t>
-            </w:r>
-          </w:p>
-          <w:p/>
+              <w:t>input array meaning that</w:t>
+            </w:r>
+            <w:r>
+              <w:t xml:space="preserve"> on the stack they are next to each other</w:t>
+            </w:r>
+          </w:p>
+          <w:p>
+            <w:pPr>
+              <w:pStyle w:val="ListParagraph"/>
+              <w:numPr>
+                <w:ilvl w:val="0"/>
+                <w:numId w:val="10"/>
+              </w:numPr>
+            </w:pPr>
+            <w:r>
+              <w:t>An overflow of the array can be triggered by writing continuously since gets will keep writing to the next memory address</w:t>
+            </w:r>
+          </w:p>
+          <w:p>
+            <w:pPr>
+              <w:pStyle w:val="ListParagraph"/>
+              <w:numPr>
+                <w:ilvl w:val="0"/>
+                <w:numId w:val="10"/>
+              </w:numPr>
+            </w:pPr>
+            <w:r>
+              <w:t>Writing 32 chars and then the letter ‘B’ will cause the ‘B’ align with the team variable on the stack and overwrite it.</w:t>
+            </w:r>
+          </w:p>
+          <w:p>
+            <w:r>
+              <w:drawing>
+                <wp:inline distT="0" distB="0" distL="0" distR="0" wp14:anchorId="3B92941C" wp14:editId="4F00D12D">
+                  <wp:extent cx="2720051" cy="1475809"/>
+                  <wp:effectExtent l="0" t="0" r="4445" b="0"/>
+                  <wp:docPr id="599002906" name="Picture 1"/>
+                  <wp:cNvGraphicFramePr>
+                    <a:graphicFrameLocks xmlns:a="http://schemas.openxmlformats.org/drawingml/2006/main" noChangeAspect="1"/>
+                  </wp:cNvGraphicFramePr>
+                  <a:graphic xmlns:a="http://schemas.openxmlformats.org/drawingml/2006/main">
+                    <a:graphicData uri="http://schemas.openxmlformats.org/drawingml/2006/picture">
+                      <pic:pic xmlns:pic="http://schemas.openxmlformats.org/drawingml/2006/picture">
+                        <pic:nvPicPr>
+                          <pic:cNvPr id="599002906" name=""/>
+                          <pic:cNvPicPr/>
+                        </pic:nvPicPr>
+                        <pic:blipFill>
+                          <a:blip r:embed="rId20"/>
+                          <a:stretch>
+                            <a:fillRect/>
+                          </a:stretch>
+                        </pic:blipFill>
+                        <pic:spPr>
+                          <a:xfrm>
+                            <a:off x="0" y="0"/>
+                            <a:ext cx="2736498" cy="1484733"/>
+                          </a:xfrm>
+                          <a:prstGeom prst="rect">
+                            <a:avLst/>
+                          </a:prstGeom>
+                        </pic:spPr>
+                      </pic:pic>
+                    </a:graphicData>
+                  </a:graphic>
+                </wp:inline>
+              </w:drawing>
+            </w:r>
+          </w:p>
           <w:p>
             <w:r>
               <w:rPr>
                 <w:noProof/>
               </w:rPr>
+              <w:lastRenderedPageBreak/>
               <w:drawing>
                 <wp:inline distT="0" distB="0" distL="0" distR="0" wp14:anchorId="0B8619BA" wp14:editId="3295A55A">
                   <wp:extent cx="4997707" cy="825542"/>
@@ -2658,7 +2716,7 @@
                           <pic:cNvPicPr/>
                         </pic:nvPicPr>
                         <pic:blipFill>
-                          <a:blip r:embed="rId20"/>
+                          <a:blip r:embed="rId21"/>
                           <a:stretch>
                             <a:fillRect/>
                           </a:stretch>
@@ -2679,8 +2737,6 @@
               </w:drawing>
             </w:r>
           </w:p>
-          <w:p/>
-          <w:p/>
           <w:p>
             <w:pPr>
               <w:rPr>
@@ -2696,6 +2752,108 @@
                 <w:u w:val="single"/>
               </w:rPr>
               <w:t>BOF2:</w:t>
+            </w:r>
+          </w:p>
+          <w:p>
+            <w:pPr>
+              <w:pStyle w:val="ListParagraph"/>
+              <w:numPr>
+                <w:ilvl w:val="0"/>
+                <w:numId w:val="10"/>
+              </w:numPr>
+              <w:rPr>
+                <w:noProof/>
+              </w:rPr>
+            </w:pPr>
+            <w:r>
+              <w:rPr>
+                <w:noProof/>
+              </w:rPr>
+              <w:t>Similarly to BOF1 except it is a function pointer that is now stored in as a memory address</w:t>
+            </w:r>
+          </w:p>
+          <w:p>
+            <w:pPr>
+              <w:pStyle w:val="ListParagraph"/>
+              <w:numPr>
+                <w:ilvl w:val="0"/>
+                <w:numId w:val="10"/>
+              </w:numPr>
+              <w:rPr>
+                <w:noProof/>
+              </w:rPr>
+            </w:pPr>
+            <w:r>
+              <w:rPr>
+                <w:noProof/>
+              </w:rPr>
+              <w:t>Once we get the memory address we need to overflow the buffer and then ensure that we overwrite the correct address into the function to so that it points to win</w:t>
+            </w:r>
+          </w:p>
+          <w:p>
+            <w:pPr>
+              <w:pStyle w:val="ListParagraph"/>
+              <w:numPr>
+                <w:ilvl w:val="0"/>
+                <w:numId w:val="10"/>
+              </w:numPr>
+              <w:rPr>
+                <w:noProof/>
+              </w:rPr>
+            </w:pPr>
+            <w:r>
+              <w:rPr>
+                <w:noProof/>
+              </w:rPr>
+              <w:t>Note that memory addresses are stored in little endian and hence need to be written accordingly</w:t>
+            </w:r>
+          </w:p>
+          <w:p>
+            <w:pPr>
+              <w:ind w:left="360"/>
+              <w:rPr>
+                <w:noProof/>
+              </w:rPr>
+            </w:pPr>
+            <w:r>
+              <w:rPr>
+                <w:noProof/>
+              </w:rPr>
+              <w:drawing>
+                <wp:inline distT="0" distB="0" distL="0" distR="0" wp14:anchorId="293E627F" wp14:editId="4BB0FF5D">
+                  <wp:extent cx="2645972" cy="2049041"/>
+                  <wp:effectExtent l="0" t="0" r="2540" b="8890"/>
+                  <wp:docPr id="2003195288" name="Picture 1"/>
+                  <wp:cNvGraphicFramePr>
+                    <a:graphicFrameLocks xmlns:a="http://schemas.openxmlformats.org/drawingml/2006/main" noChangeAspect="1"/>
+                  </wp:cNvGraphicFramePr>
+                  <a:graphic xmlns:a="http://schemas.openxmlformats.org/drawingml/2006/main">
+                    <a:graphicData uri="http://schemas.openxmlformats.org/drawingml/2006/picture">
+                      <pic:pic xmlns:pic="http://schemas.openxmlformats.org/drawingml/2006/picture">
+                        <pic:nvPicPr>
+                          <pic:cNvPr id="2003195288" name=""/>
+                          <pic:cNvPicPr/>
+                        </pic:nvPicPr>
+                        <pic:blipFill>
+                          <a:blip r:embed="rId22"/>
+                          <a:stretch>
+                            <a:fillRect/>
+                          </a:stretch>
+                        </pic:blipFill>
+                        <pic:spPr>
+                          <a:xfrm>
+                            <a:off x="0" y="0"/>
+                            <a:ext cx="2654073" cy="2055315"/>
+                          </a:xfrm>
+                          <a:prstGeom prst="rect">
+                            <a:avLst/>
+                          </a:prstGeom>
+                        </pic:spPr>
+                      </pic:pic>
+                    </a:graphicData>
+                  </a:graphic>
+                </wp:inline>
+              </w:drawing>
             </w:r>
           </w:p>
           <w:p>
@@ -2719,7 +2877,7 @@
                           <pic:cNvPicPr/>
                         </pic:nvPicPr>
                         <pic:blipFill>
-                          <a:blip r:embed="rId21"/>
+                          <a:blip r:embed="rId23"/>
                           <a:stretch>
                             <a:fillRect/>
                           </a:stretch>
@@ -2740,7 +2898,6 @@
               </w:drawing>
             </w:r>
           </w:p>
-          <w:p/>
           <w:p>
             <w:pPr>
               <w:rPr>
@@ -2755,12 +2912,192 @@
                 <w:bCs/>
                 <w:u w:val="single"/>
               </w:rPr>
+              <w:t>BOF3:</w:t>
+            </w:r>
+          </w:p>
+          <w:p>
+            <w:pPr>
+              <w:pStyle w:val="ListParagraph"/>
+              <w:numPr>
+                <w:ilvl w:val="0"/>
+                <w:numId w:val="10"/>
+              </w:numPr>
+            </w:pPr>
+            <w:r>
+              <w:t>Instead of editing an explicit stack variable as was in previous cases, we need to edit the return address which is stored on the stack.</w:t>
+            </w:r>
+          </w:p>
+          <w:p>
+            <w:pPr>
+              <w:pStyle w:val="ListParagraph"/>
+              <w:numPr>
+                <w:ilvl w:val="0"/>
+                <w:numId w:val="10"/>
+              </w:numPr>
+            </w:pPr>
+            <w:r>
+              <w:t>We also need to find the address of the desired function on the stack.</w:t>
+            </w:r>
+          </w:p>
+          <w:p>
+            <w:pPr>
+              <w:pStyle w:val="ListParagraph"/>
+              <w:numPr>
+                <w:ilvl w:val="0"/>
+                <w:numId w:val="10"/>
+              </w:numPr>
+            </w:pPr>
+            <w:r>
+              <w:t>This also means that any alignment and extra setup terms will need to be accounted for between the array allocation and the return address</w:t>
+            </w:r>
+            <w:r>
+              <w:t xml:space="preserve"> from the stack diagrams it is shown to be 0x28 to the EBP which mean that it will be 44 (0x28 + 0x04) bytes from the array start to the return address</w:t>
+            </w:r>
+          </w:p>
+          <w:p>
+            <w:pPr>
+              <w:pStyle w:val="ListParagraph"/>
+              <w:numPr>
+                <w:ilvl w:val="0"/>
+                <w:numId w:val="10"/>
+              </w:numPr>
+            </w:pPr>
+            <w:r>
+              <w:t>Using pwn tools we can search for the address of the function inside the executable and then put that at the end in little endian</w:t>
+            </w:r>
+            <w:r>
+              <w:t xml:space="preserve"> which can be formulated inside a python script.</w:t>
+            </w:r>
+          </w:p>
+          <w:p>
+            <w:pPr>
+              <w:pStyle w:val="ListParagraph"/>
+            </w:pPr>
+            <w:r>
               <w:lastRenderedPageBreak/>
-              <w:t>BOF3:</w:t>
-            </w:r>
-          </w:p>
-          <w:p>
-            <w:r>
+              <w:drawing>
+                <wp:inline distT="0" distB="0" distL="0" distR="0" wp14:anchorId="0F5BC375" wp14:editId="74EC979E">
+                  <wp:extent cx="3130952" cy="2071312"/>
+                  <wp:effectExtent l="0" t="0" r="0" b="5715"/>
+                  <wp:docPr id="1111925710" name="Picture 1"/>
+                  <wp:cNvGraphicFramePr>
+                    <a:graphicFrameLocks xmlns:a="http://schemas.openxmlformats.org/drawingml/2006/main" noChangeAspect="1"/>
+                  </wp:cNvGraphicFramePr>
+                  <a:graphic xmlns:a="http://schemas.openxmlformats.org/drawingml/2006/main">
+                    <a:graphicData uri="http://schemas.openxmlformats.org/drawingml/2006/picture">
+                      <pic:pic xmlns:pic="http://schemas.openxmlformats.org/drawingml/2006/picture">
+                        <pic:nvPicPr>
+                          <pic:cNvPr id="1111925710" name=""/>
+                          <pic:cNvPicPr/>
+                        </pic:nvPicPr>
+                        <pic:blipFill>
+                          <a:blip r:embed="rId24"/>
+                          <a:stretch>
+                            <a:fillRect/>
+                          </a:stretch>
+                        </pic:blipFill>
+                        <pic:spPr>
+                          <a:xfrm>
+                            <a:off x="0" y="0"/>
+                            <a:ext cx="3143753" cy="2079780"/>
+                          </a:xfrm>
+                          <a:prstGeom prst="rect">
+                            <a:avLst/>
+                          </a:prstGeom>
+                        </pic:spPr>
+                      </pic:pic>
+                    </a:graphicData>
+                  </a:graphic>
+                </wp:inline>
+              </w:drawing>
+            </w:r>
+          </w:p>
+          <w:p>
+            <w:pPr>
+              <w:pStyle w:val="ListParagraph"/>
+            </w:pPr>
+            <w:r>
+              <w:drawing>
+                <wp:inline distT="0" distB="0" distL="0" distR="0" wp14:anchorId="0D43AE93" wp14:editId="50216934">
+                  <wp:extent cx="3998707" cy="1368361"/>
+                  <wp:effectExtent l="0" t="0" r="1905" b="3810"/>
+                  <wp:docPr id="1938833347" name="Picture 1"/>
+                  <wp:cNvGraphicFramePr>
+                    <a:graphicFrameLocks xmlns:a="http://schemas.openxmlformats.org/drawingml/2006/main" noChangeAspect="1"/>
+                  </wp:cNvGraphicFramePr>
+                  <a:graphic xmlns:a="http://schemas.openxmlformats.org/drawingml/2006/main">
+                    <a:graphicData uri="http://schemas.openxmlformats.org/drawingml/2006/picture">
+                      <pic:pic xmlns:pic="http://schemas.openxmlformats.org/drawingml/2006/picture">
+                        <pic:nvPicPr>
+                          <pic:cNvPr id="1938833347" name=""/>
+                          <pic:cNvPicPr/>
+                        </pic:nvPicPr>
+                        <pic:blipFill>
+                          <a:blip r:embed="rId25"/>
+                          <a:stretch>
+                            <a:fillRect/>
+                          </a:stretch>
+                        </pic:blipFill>
+                        <pic:spPr>
+                          <a:xfrm>
+                            <a:off x="0" y="0"/>
+                            <a:ext cx="4007811" cy="1371476"/>
+                          </a:xfrm>
+                          <a:prstGeom prst="rect">
+                            <a:avLst/>
+                          </a:prstGeom>
+                        </pic:spPr>
+                      </pic:pic>
+                    </a:graphicData>
+                  </a:graphic>
+                </wp:inline>
+              </w:drawing>
+            </w:r>
+          </w:p>
+          <w:p>
+            <w:r>
+              <w:drawing>
+                <wp:inline distT="0" distB="0" distL="0" distR="0" wp14:anchorId="3B8428A6" wp14:editId="5818296B">
+                  <wp:extent cx="5943600" cy="1979295"/>
+                  <wp:effectExtent l="0" t="0" r="0" b="1905"/>
+                  <wp:docPr id="311647900" name="Picture 1"/>
+                  <wp:cNvGraphicFramePr>
+                    <a:graphicFrameLocks xmlns:a="http://schemas.openxmlformats.org/drawingml/2006/main" noChangeAspect="1"/>
+                  </wp:cNvGraphicFramePr>
+                  <a:graphic xmlns:a="http://schemas.openxmlformats.org/drawingml/2006/main">
+                    <a:graphicData uri="http://schemas.openxmlformats.org/drawingml/2006/picture">
+                      <pic:pic xmlns:pic="http://schemas.openxmlformats.org/drawingml/2006/picture">
+                        <pic:nvPicPr>
+                          <pic:cNvPr id="311647900" name=""/>
+                          <pic:cNvPicPr/>
+                        </pic:nvPicPr>
+                        <pic:blipFill>
+                          <a:blip r:embed="rId26"/>
+                          <a:stretch>
+                            <a:fillRect/>
+                          </a:stretch>
+                        </pic:blipFill>
+                        <pic:spPr>
+                          <a:xfrm>
+                            <a:off x="0" y="0"/>
+                            <a:ext cx="5943600" cy="1979295"/>
+                          </a:xfrm>
+                          <a:prstGeom prst="rect">
+                            <a:avLst/>
+                          </a:prstGeom>
+                        </pic:spPr>
+                      </pic:pic>
+                    </a:graphicData>
+                  </a:graphic>
+                </wp:inline>
+              </w:drawing>
+            </w:r>
+          </w:p>
+          <w:p>
+            <w:r>
+              <w:rPr>
+                <w:noProof/>
+              </w:rPr>
               <w:drawing>
                 <wp:inline distT="0" distB="0" distL="0" distR="0" wp14:anchorId="07D02C64" wp14:editId="5843AE80">
                   <wp:extent cx="4381725" cy="2305168"/>
@@ -2777,7 +3114,7 @@
                           <pic:cNvPicPr/>
                         </pic:nvPicPr>
                         <pic:blipFill>
-                          <a:blip r:embed="rId22"/>
+                          <a:blip r:embed="rId27"/>
                           <a:stretch>
                             <a:fillRect/>
                           </a:stretch>
@@ -2798,43 +3135,24 @@
               </w:drawing>
             </w:r>
           </w:p>
-          <w:p>
-            <w:r>
-              <w:drawing>
-                <wp:inline distT="0" distB="0" distL="0" distR="0" wp14:anchorId="3B4F1B72" wp14:editId="64DCC8D1">
-                  <wp:extent cx="5943600" cy="1355090"/>
-                  <wp:effectExtent l="0" t="0" r="0" b="0"/>
-                  <wp:docPr id="1182803973" name="Picture 1"/>
-                  <wp:cNvGraphicFramePr>
-                    <a:graphicFrameLocks xmlns:a="http://schemas.openxmlformats.org/drawingml/2006/main" noChangeAspect="1"/>
-                  </wp:cNvGraphicFramePr>
-                  <a:graphic xmlns:a="http://schemas.openxmlformats.org/drawingml/2006/main">
-                    <a:graphicData uri="http://schemas.openxmlformats.org/drawingml/2006/picture">
-                      <pic:pic xmlns:pic="http://schemas.openxmlformats.org/drawingml/2006/picture">
-                        <pic:nvPicPr>
-                          <pic:cNvPr id="1182803973" name=""/>
-                          <pic:cNvPicPr/>
-                        </pic:nvPicPr>
-                        <pic:blipFill>
-                          <a:blip r:embed="rId23"/>
-                          <a:stretch>
-                            <a:fillRect/>
-                          </a:stretch>
-                        </pic:blipFill>
-                        <pic:spPr>
-                          <a:xfrm>
-                            <a:off x="0" y="0"/>
-                            <a:ext cx="5943600" cy="1355090"/>
-                          </a:xfrm>
-                          <a:prstGeom prst="rect">
-                            <a:avLst/>
-                          </a:prstGeom>
-                        </pic:spPr>
-                      </pic:pic>
-                    </a:graphicData>
-                  </a:graphic>
-                </wp:inline>
-              </w:drawing>
+          <w:p/>
+          <w:p/>
+          <w:p>
+            <w:pPr>
+              <w:rPr>
+                <w:b/>
+                <w:bCs/>
+                <w:u w:val="single"/>
+              </w:rPr>
+            </w:pPr>
+            <w:r>
+              <w:rPr>
+                <w:b/>
+                <w:bCs/>
+                <w:u w:val="single"/>
+              </w:rPr>
+              <w:lastRenderedPageBreak/>
+              <w:t>BOF4:</w:t>
             </w:r>
           </w:p>
           <w:p>
@@ -2846,10 +3164,7 @@
               </w:numPr>
             </w:pPr>
             <w:r>
-              <w:t xml:space="preserve">32 bytes as the array + 4 bytes for EBP </w:t>
-            </w:r>
-            <w:r>
-              <w:t xml:space="preserve">+  </w:t>
+              <w:t>This exercise has a canary that we need to get passed, since if we brutally overwrite whatever to the memory and then edit the return address the canary will be triggered and we will not return properly.</w:t>
             </w:r>
           </w:p>
           <w:p>
@@ -2861,33 +3176,65 @@
               </w:numPr>
             </w:pPr>
             <w:r>
-              <w:t>Offset with EBP needed to be considered and hence injected</w:t>
+              <w:t>The way to get around the canary is to be able to edit it.</w:t>
             </w:r>
           </w:p>
           <w:p>
             <w:pPr>
-              <w:rPr>
-                <w:b/>
-                <w:bCs/>
-                <w:u w:val="single"/>
-              </w:rPr>
+              <w:pStyle w:val="ListParagraph"/>
+              <w:numPr>
+                <w:ilvl w:val="0"/>
+                <w:numId w:val="10"/>
+              </w:numPr>
             </w:pPr>
             <w:r>
-              <w:rPr>
-                <w:b/>
-                <w:bCs/>
-                <w:u w:val="single"/>
-              </w:rPr>
-              <w:t>BOF4:</w:t>
-            </w:r>
-          </w:p>
-          <w:p/>
-          <w:p>
-            <w:r>
+              <w:t xml:space="preserve">Inspecting the code the canary is our fortune number printed out. </w:t>
+            </w:r>
+          </w:p>
+          <w:p>
+            <w:pPr>
+              <w:pStyle w:val="ListParagraph"/>
+              <w:numPr>
+                <w:ilvl w:val="0"/>
+                <w:numId w:val="10"/>
+              </w:numPr>
+            </w:pPr>
+            <w:r>
+              <w:t>If we write a script that dynamically reads that in and then overflows the buffer puts the canary value in the correct place and then changes the return address we will be able to control our program flow.</w:t>
+            </w:r>
+          </w:p>
+          <w:p>
+            <w:pPr>
+              <w:pStyle w:val="ListParagraph"/>
+              <w:numPr>
+                <w:ilvl w:val="0"/>
+                <w:numId w:val="10"/>
+              </w:numPr>
+            </w:pPr>
+            <w:r>
+              <w:t>There is exactly 32 bytes between the name and canary and then 12 bytes between the return address and the canary hence a python script can be executed to form an input string that achieves the buffer overflow</w:t>
+            </w:r>
+          </w:p>
+          <w:p>
+            <w:pPr>
+              <w:ind w:left="360"/>
+            </w:pPr>
+            <w:r>
+              <w:rPr>
+                <w:noProof/>
+              </w:rPr>
               <w:drawing>
-                <wp:inline distT="0" distB="0" distL="0" distR="0" wp14:anchorId="7BBE6DDF" wp14:editId="5389F59A">
-                  <wp:extent cx="2978303" cy="1949550"/>
-                  <wp:effectExtent l="0" t="0" r="0" b="0"/>
+                <wp:anchor distT="0" distB="0" distL="114300" distR="114300" simplePos="0" relativeHeight="251662336" behindDoc="0" locked="0" layoutInCell="1" allowOverlap="1" wp14:anchorId="490EC160" wp14:editId="00A45194">
+                  <wp:simplePos x="0" y="0"/>
+                  <wp:positionH relativeFrom="column">
+                    <wp:posOffset>2989077</wp:posOffset>
+                  </wp:positionH>
+                  <wp:positionV relativeFrom="paragraph">
+                    <wp:posOffset>253491</wp:posOffset>
+                  </wp:positionV>
+                  <wp:extent cx="2869565" cy="1878330"/>
+                  <wp:effectExtent l="0" t="0" r="6985" b="7620"/>
+                  <wp:wrapSquare wrapText="bothSides"/>
                   <wp:docPr id="890198387" name="Picture 1"/>
                   <wp:cNvGraphicFramePr>
                     <a:graphicFrameLocks xmlns:a="http://schemas.openxmlformats.org/drawingml/2006/main" noChangeAspect="1"/>
@@ -2900,7 +3247,13 @@
                           <pic:cNvPicPr/>
                         </pic:nvPicPr>
                         <pic:blipFill>
-                          <a:blip r:embed="rId24"/>
+                          <a:blip r:embed="rId28">
+                            <a:extLst>
+                              <a:ext uri="{28A0092B-C50C-407E-A947-70E740481C1C}">
+                                <a14:useLocalDpi xmlns:a14="http://schemas.microsoft.com/office/drawing/2010/main" val="0"/>
+                              </a:ext>
+                            </a:extLst>
+                          </a:blip>
                           <a:stretch>
                             <a:fillRect/>
                           </a:stretch>
@@ -2908,7 +3261,109 @@
                         <pic:spPr>
                           <a:xfrm>
                             <a:off x="0" y="0"/>
-                            <a:ext cx="2978303" cy="1949550"/>
+                            <a:ext cx="2869565" cy="1878330"/>
+                          </a:xfrm>
+                          <a:prstGeom prst="rect">
+                            <a:avLst/>
+                          </a:prstGeom>
+                        </pic:spPr>
+                      </pic:pic>
+                    </a:graphicData>
+                  </a:graphic>
+                  <wp14:sizeRelH relativeFrom="margin">
+                    <wp14:pctWidth>0</wp14:pctWidth>
+                  </wp14:sizeRelH>
+                  <wp14:sizeRelV relativeFrom="margin">
+                    <wp14:pctHeight>0</wp14:pctHeight>
+                  </wp14:sizeRelV>
+                </wp:anchor>
+              </w:drawing>
+            </w:r>
+            <w:r>
+              <w:drawing>
+                <wp:anchor distT="0" distB="0" distL="114300" distR="114300" simplePos="0" relativeHeight="251661312" behindDoc="0" locked="0" layoutInCell="1" allowOverlap="1" wp14:anchorId="4A287251" wp14:editId="37A6253D">
+                  <wp:simplePos x="0" y="0"/>
+                  <wp:positionH relativeFrom="column">
+                    <wp:posOffset>228600</wp:posOffset>
+                  </wp:positionH>
+                  <wp:positionV relativeFrom="paragraph">
+                    <wp:posOffset>273050</wp:posOffset>
+                  </wp:positionV>
+                  <wp:extent cx="2806700" cy="1946275"/>
+                  <wp:effectExtent l="0" t="0" r="0" b="0"/>
+                  <wp:wrapSquare wrapText="bothSides"/>
+                  <wp:docPr id="2137343612" name="Picture 1"/>
+                  <wp:cNvGraphicFramePr>
+                    <a:graphicFrameLocks xmlns:a="http://schemas.openxmlformats.org/drawingml/2006/main" noChangeAspect="1"/>
+                  </wp:cNvGraphicFramePr>
+                  <a:graphic xmlns:a="http://schemas.openxmlformats.org/drawingml/2006/main">
+                    <a:graphicData uri="http://schemas.openxmlformats.org/drawingml/2006/picture">
+                      <pic:pic xmlns:pic="http://schemas.openxmlformats.org/drawingml/2006/picture">
+                        <pic:nvPicPr>
+                          <pic:cNvPr id="2137343612" name=""/>
+                          <pic:cNvPicPr/>
+                        </pic:nvPicPr>
+                        <pic:blipFill>
+                          <a:blip r:embed="rId29" cstate="print">
+                            <a:extLst>
+                              <a:ext uri="{28A0092B-C50C-407E-A947-70E740481C1C}">
+                                <a14:useLocalDpi xmlns:a14="http://schemas.microsoft.com/office/drawing/2010/main" val="0"/>
+                              </a:ext>
+                            </a:extLst>
+                          </a:blip>
+                          <a:stretch>
+                            <a:fillRect/>
+                          </a:stretch>
+                        </pic:blipFill>
+                        <pic:spPr>
+                          <a:xfrm>
+                            <a:off x="0" y="0"/>
+                            <a:ext cx="2806700" cy="1946275"/>
+                          </a:xfrm>
+                          <a:prstGeom prst="rect">
+                            <a:avLst/>
+                          </a:prstGeom>
+                        </pic:spPr>
+                      </pic:pic>
+                    </a:graphicData>
+                  </a:graphic>
+                  <wp14:sizeRelH relativeFrom="margin">
+                    <wp14:pctWidth>0</wp14:pctWidth>
+                  </wp14:sizeRelH>
+                  <wp14:sizeRelV relativeFrom="margin">
+                    <wp14:pctHeight>0</wp14:pctHeight>
+                  </wp14:sizeRelV>
+                </wp:anchor>
+              </w:drawing>
+            </w:r>
+          </w:p>
+          <w:p>
+            <w:r>
+              <w:drawing>
+                <wp:inline distT="0" distB="0" distL="0" distR="0" wp14:anchorId="7B0AD6A8" wp14:editId="47E6432E">
+                  <wp:extent cx="3287210" cy="1449745"/>
+                  <wp:effectExtent l="0" t="0" r="8890" b="0"/>
+                  <wp:docPr id="1414229956" name="Picture 1"/>
+                  <wp:cNvGraphicFramePr>
+                    <a:graphicFrameLocks xmlns:a="http://schemas.openxmlformats.org/drawingml/2006/main" noChangeAspect="1"/>
+                  </wp:cNvGraphicFramePr>
+                  <a:graphic xmlns:a="http://schemas.openxmlformats.org/drawingml/2006/main">
+                    <a:graphicData uri="http://schemas.openxmlformats.org/drawingml/2006/picture">
+                      <pic:pic xmlns:pic="http://schemas.openxmlformats.org/drawingml/2006/picture">
+                        <pic:nvPicPr>
+                          <pic:cNvPr id="1414229956" name=""/>
+                          <pic:cNvPicPr/>
+                        </pic:nvPicPr>
+                        <pic:blipFill>
+                          <a:blip r:embed="rId30"/>
+                          <a:stretch>
+                            <a:fillRect/>
+                          </a:stretch>
+                        </pic:blipFill>
+                        <pic:spPr>
+                          <a:xfrm>
+                            <a:off x="0" y="0"/>
+                            <a:ext cx="3314622" cy="1461834"/>
                           </a:xfrm>
                           <a:prstGeom prst="rect">
                             <a:avLst/>
@@ -2920,7 +3375,45 @@
                 </wp:inline>
               </w:drawing>
             </w:r>
-          </w:p>
+            <w:r>
+              <w:drawing>
+                <wp:inline distT="0" distB="0" distL="0" distR="0" wp14:anchorId="2705E5A8" wp14:editId="284835C6">
+                  <wp:extent cx="5943600" cy="1713865"/>
+                  <wp:effectExtent l="0" t="0" r="0" b="635"/>
+                  <wp:docPr id="2117241482" name="Picture 1"/>
+                  <wp:cNvGraphicFramePr>
+                    <a:graphicFrameLocks xmlns:a="http://schemas.openxmlformats.org/drawingml/2006/main" noChangeAspect="1"/>
+                  </wp:cNvGraphicFramePr>
+                  <a:graphic xmlns:a="http://schemas.openxmlformats.org/drawingml/2006/main">
+                    <a:graphicData uri="http://schemas.openxmlformats.org/drawingml/2006/picture">
+                      <pic:pic xmlns:pic="http://schemas.openxmlformats.org/drawingml/2006/picture">
+                        <pic:nvPicPr>
+                          <pic:cNvPr id="2117241482" name=""/>
+                          <pic:cNvPicPr/>
+                        </pic:nvPicPr>
+                        <pic:blipFill>
+                          <a:blip r:embed="rId31"/>
+                          <a:stretch>
+                            <a:fillRect/>
+                          </a:stretch>
+                        </pic:blipFill>
+                        <pic:spPr>
+                          <a:xfrm>
+                            <a:off x="0" y="0"/>
+                            <a:ext cx="5943600" cy="1713865"/>
+                          </a:xfrm>
+                          <a:prstGeom prst="rect">
+                            <a:avLst/>
+                          </a:prstGeom>
+                        </pic:spPr>
+                      </pic:pic>
+                    </a:graphicData>
+                  </a:graphic>
+                </wp:inline>
+              </w:drawing>
+            </w:r>
+          </w:p>
+          <w:p/>
         </w:tc>
       </w:tr>
     </w:tbl>
@@ -2942,6 +3435,7 @@
           <w:b/>
           <w:bCs/>
         </w:rPr>
+        <w:lastRenderedPageBreak/>
         <w:t>Analysis and Reflection</w:t>
       </w:r>
     </w:p>
@@ -2949,7 +3443,7 @@
       <w:pPr>
         <w:pStyle w:val="Heading2"/>
       </w:pPr>
-      <w:hyperlink r:id="rId25">
+      <w:hyperlink r:id="rId32">
         <w:r>
           <w:rPr>
             <w:rStyle w:val="Hyperlink"/>
@@ -2984,7 +3478,6 @@
           <w:p/>
           <w:p>
             <w:r>
-              <w:lastRenderedPageBreak/>
               <w:t xml:space="preserve">In this </w:t>
             </w:r>
             <w:r>
@@ -3286,9 +3779,17 @@
         <w:t>To submit a valid portfolio entry, complete the activities, save your work as a PDF, and upload it to the relevant week’s submission page on Moodle.</w:t>
       </w:r>
     </w:p>
+    <w:p/>
+    <w:p>
+      <w:r>
+        <w:lastRenderedPageBreak/>
+        <w:t>Acknowledgement: Please note that artificial intelligence has been used for simple grammatical editing my written work.</w:t>
+      </w:r>
+    </w:p>
+    <w:p/>
     <w:sectPr>
-      <w:headerReference w:type="default" r:id="rId26"/>
-      <w:footerReference w:type="default" r:id="rId27"/>
+      <w:headerReference w:type="default" r:id="rId33"/>
+      <w:footerReference w:type="default" r:id="rId34"/>
       <w:pgSz w:w="12240" w:h="15840"/>
       <w:pgMar w:top="1440" w:right="1440" w:bottom="1440" w:left="1440" w:header="720" w:footer="720" w:gutter="0"/>
       <w:cols w:space="720"/>

</xml_diff>